<commit_message>
Clarify supplementary table labels
Co-authored-by: dreamcheap2000 <229635625+dreamcheap2000@users.noreply.github.com>
</commit_message>
<xml_diff>
--- a/20260912_Tables_1840_Supplementary.docx
+++ b/20260912_Tables_1840_Supplementary.docx
@@ -1460,7 +1460,7 @@
           <w:b/>
           <w:sz w:val="20"/>
         </w:rPr>
-        <w:t>Supplementary Table S2. Full predictor-by-model stable coefficient matrix</w:t>
+        <w:t>Supplementary Table S2. Full publication Table 1 Panel B stable coefficient matrix</w:t>
       </w:r>
     </w:p>
     <w:p>
@@ -1471,7 +1471,7 @@
         <w:rPr>
           <w:sz w:val="16"/>
         </w:rPr>
-        <w:t>Cells are bootstrap mean coefficient (bootstrap SD) [95% CI]; selection frequency.</w:t>
+        <w:t>Rows are predictors and columns are retained models. Cells are bootstrap mean coefficient (bootstrap SD) [95% CI]; selection frequency.</w:t>
       </w:r>
     </w:p>
     <w:tbl>
@@ -5725,7 +5725,7 @@
           <w:b/>
           <w:sz w:val="20"/>
         </w:rPr>
-        <w:t>Supplementary Table S3. Full stable coefficient details by predictor-model pairing</w:t>
+        <w:t>Supplementary Table S3. Full publication Table 2 detailed stable coefficients</w:t>
       </w:r>
     </w:p>
     <w:p>
@@ -5736,7 +5736,7 @@
         <w:rPr>
           <w:sz w:val="16"/>
         </w:rPr>
-        <w:t>This table retains the detailed coefficient rows for every stable predictor-model pairing.</w:t>
+        <w:t>This table retains the detailed coefficient rows for every stable predictor-model pairing from the original publication Table 2 export.</w:t>
       </w:r>
     </w:p>
     <w:tbl>

</xml_diff>